<commit_message>
feat: selvbaerende build - build_docx.py + img/ + byg-alle-tilstand; genbyg .docx fra repoet
</commit_message>
<xml_diff>
--- a/Laerervejledning_Etiske-dilemmaer.docx
+++ b/Laerervejledning_Etiske-dilemmaer.docx
@@ -20,77 +20,60 @@
     </w:p>
     <w:p>
       <w:pPr>
-        <w:ind w:left="360"/>
+        <w:shd w:val="clear" w:fill="EEF1F6"/>
+        <w:ind w:left="259" w:right="144"/>
       </w:pPr>
       <w:r>
         <w:rPr>
           <w:b/>
-          <w:i/>
         </w:rPr>
         <w:t>Bemærk:</w:t>
       </w:r>
       <w:r>
-        <w:rPr>
-          <w:i/>
-        </w:rPr>
         <w:t xml:space="preserve"> Der findes </w:t>
       </w:r>
       <w:r>
         <w:rPr>
           <w:b/>
-          <w:i/>
         </w:rPr>
         <w:t>ingen facitnøgle</w:t>
       </w:r>
       <w:r>
-        <w:rPr>
-          <w:i/>
-        </w:rPr>
         <w:t xml:space="preserve"> til et etisk dilemma — pointen er netop, at det kan ses fra flere sider. Denne vejledning giver dig </w:t>
       </w:r>
       <w:r>
         <w:rPr>
           <w:b/>
-          <w:i/>
         </w:rPr>
         <w:t>svar-vinkler</w:t>
       </w:r>
       <w:r>
-        <w:rPr>
-          <w:i/>
-        </w:rPr>
         <w:t xml:space="preserve"> pr. dilemma (hvad de fire etikker typisk ville sige), en </w:t>
       </w:r>
       <w:r>
         <w:rPr>
           <w:b/>
-          <w:i/>
         </w:rPr>
         <w:t>tidsplan</w:t>
       </w:r>
       <w:r>
-        <w:rPr>
-          <w:i/>
-        </w:rPr>
         <w:t xml:space="preserve">, gode </w:t>
       </w:r>
       <w:r>
         <w:rPr>
           <w:b/>
-          <w:i/>
         </w:rPr>
         <w:t>opfølgningsspørgsmål</w:t>
       </w:r>
       <w:r>
-        <w:rPr>
-          <w:i/>
-        </w:rPr>
         <w:t xml:space="preserve"> og tips til at holde samtalen i gang. Brug den til at facilitere — ikke til at "rette".</w:t>
       </w:r>
     </w:p>
     <w:p>
       <w:pPr>
-        <w:spacing w:after="120"/>
+        <w:pBdr>
+          <w:bottom w:val="single" w:sz="6" w:space="1" w:color="BBBBBB"/>
+        </w:pBdr>
       </w:pPr>
     </w:p>
     <w:p>
@@ -177,7 +160,9 @@
     </w:p>
     <w:p>
       <w:pPr>
-        <w:spacing w:after="120"/>
+        <w:pBdr>
+          <w:bottom w:val="single" w:sz="6" w:space="1" w:color="BBBBBB"/>
+        </w:pBdr>
       </w:pPr>
     </w:p>
     <w:p>
@@ -190,7 +175,7 @@
     </w:p>
     <w:tbl>
       <w:tblPr>
-        <w:tblStyle w:val="TableGrid"/>
+        <w:tblStyle w:val="LightGrid-Accent1"/>
         <w:tblW w:type="auto" w:w="0"/>
         <w:tblLook w:firstColumn="1" w:firstRow="1" w:lastColumn="0" w:lastRow="0" w:noHBand="0" w:noVBand="1" w:val="04A0"/>
       </w:tblPr>
@@ -209,6 +194,11 @@
               <w:rPr>
                 <w:b/>
               </w:rPr>
+            </w:r>
+            <w:r>
+              <w:rPr>
+                <w:b/>
+              </w:rPr>
               <w:t>Etik</w:t>
             </w:r>
           </w:p>
@@ -218,6 +208,11 @@
             <w:tcW w:type="dxa" w:w="2880"/>
           </w:tcPr>
           <w:p>
+            <w:r>
+              <w:rPr>
+                <w:b/>
+              </w:rPr>
+            </w:r>
             <w:r>
               <w:rPr>
                 <w:b/>
@@ -235,6 +230,11 @@
               <w:rPr>
                 <w:b/>
               </w:rPr>
+            </w:r>
+            <w:r>
+              <w:rPr>
+                <w:b/>
+              </w:rPr>
               <w:t>"Tommelfingerregel"</w:t>
             </w:r>
           </w:p>
@@ -246,6 +246,7 @@
             <w:tcW w:type="dxa" w:w="2880"/>
           </w:tcPr>
           <w:p>
+            <w:r/>
             <w:r>
               <w:rPr>
                 <w:b/>
@@ -262,6 +263,7 @@
             <w:tcW w:type="dxa" w:w="2880"/>
           </w:tcPr>
           <w:p>
+            <w:r/>
             <w:r>
               <w:t>Nogle handlinger er rigtige/forkerte i sig selv, uanset følgerne. Man må ikke bruge mennesker som blotte midler.</w:t>
             </w:r>
@@ -272,6 +274,7 @@
             <w:tcW w:type="dxa" w:w="2880"/>
           </w:tcPr>
           <w:p>
+            <w:r/>
             <w:r>
               <w:t xml:space="preserve">"Det er forkert, fordi handlingen </w:t>
             </w:r>
@@ -293,6 +296,7 @@
             <w:tcW w:type="dxa" w:w="2880"/>
           </w:tcPr>
           <w:p>
+            <w:r/>
             <w:r>
               <w:rPr>
                 <w:b/>
@@ -309,6 +313,7 @@
             <w:tcW w:type="dxa" w:w="2880"/>
           </w:tcPr>
           <w:p>
+            <w:r/>
             <w:r>
               <w:t>Følgerne afgør. Mest mulig lykke / mindst mulig lidelse for flest mulige.</w:t>
             </w:r>
@@ -319,6 +324,7 @@
             <w:tcW w:type="dxa" w:w="2880"/>
           </w:tcPr>
           <w:p>
+            <w:r/>
             <w:r>
               <w:t>"Hvad kommer der ud af det — for hvem?"</w:t>
             </w:r>
@@ -331,6 +337,7 @@
             <w:tcW w:type="dxa" w:w="2880"/>
           </w:tcPr>
           <w:p>
+            <w:r/>
             <w:r>
               <w:rPr>
                 <w:b/>
@@ -347,6 +354,7 @@
             <w:tcW w:type="dxa" w:w="2880"/>
           </w:tcPr>
           <w:p>
+            <w:r/>
             <w:r>
               <w:t>Karakter frem for regler. Hvad ville et klogt, modigt, ærligt menneske gøre?</w:t>
             </w:r>
@@ -357,6 +365,7 @@
             <w:tcW w:type="dxa" w:w="2880"/>
           </w:tcPr>
           <w:p>
+            <w:r/>
             <w:r>
               <w:t>"Hvilken slags menneske bliver jeg af at handle sådan?"</w:t>
             </w:r>
@@ -369,6 +378,7 @@
             <w:tcW w:type="dxa" w:w="2880"/>
           </w:tcPr>
           <w:p>
+            <w:r/>
             <w:r>
               <w:rPr>
                 <w:b/>
@@ -385,6 +395,7 @@
             <w:tcW w:type="dxa" w:w="2880"/>
           </w:tcPr>
           <w:p>
+            <w:r/>
             <w:r>
               <w:t>Vi har ansvar for det menneske, vi står overfor. "Den enkelte har aldrig med et andet menneske at gøre uden at holde noget af dets liv i sin hånd."</w:t>
             </w:r>
@@ -395,6 +406,7 @@
             <w:tcW w:type="dxa" w:w="2880"/>
           </w:tcPr>
           <w:p>
+            <w:r/>
             <w:r>
               <w:t>"Hvad har den, der er tæt på mig, brug for nu?"</w:t>
             </w:r>
@@ -402,7 +414,6 @@
         </w:tc>
       </w:tr>
     </w:tbl>
-    <w:p/>
     <w:p>
       <w:r>
         <w:rPr>
@@ -425,7 +436,9 @@
     </w:p>
     <w:p>
       <w:pPr>
-        <w:spacing w:after="120"/>
+        <w:pBdr>
+          <w:bottom w:val="single" w:sz="6" w:space="1" w:color="BBBBBB"/>
+        </w:pBdr>
       </w:pPr>
     </w:p>
     <w:p>
@@ -438,7 +451,7 @@
     </w:p>
     <w:tbl>
       <w:tblPr>
-        <w:tblStyle w:val="TableGrid"/>
+        <w:tblStyle w:val="LightGrid-Accent1"/>
         <w:tblW w:type="auto" w:w="0"/>
         <w:tblLook w:firstColumn="1" w:firstRow="1" w:lastColumn="0" w:lastRow="0" w:noHBand="0" w:noVBand="1" w:val="04A0"/>
       </w:tblPr>
@@ -456,6 +469,11 @@
               <w:rPr>
                 <w:b/>
               </w:rPr>
+            </w:r>
+            <w:r>
+              <w:rPr>
+                <w:b/>
+              </w:rPr>
               <w:t>Tid</w:t>
             </w:r>
           </w:p>
@@ -465,6 +483,11 @@
             <w:tcW w:type="dxa" w:w="4320"/>
           </w:tcPr>
           <w:p>
+            <w:r>
+              <w:rPr>
+                <w:b/>
+              </w:rPr>
+            </w:r>
             <w:r>
               <w:rPr>
                 <w:b/>
@@ -480,6 +503,7 @@
             <w:tcW w:type="dxa" w:w="4320"/>
           </w:tcPr>
           <w:p>
+            <w:r/>
             <w:r>
               <w:t>10 min</w:t>
             </w:r>
@@ -490,6 +514,7 @@
             <w:tcW w:type="dxa" w:w="4320"/>
           </w:tcPr>
           <w:p>
+            <w:r/>
             <w:r>
               <w:t>Introducér de fire etikker (brug skemaet + eksemplet med "en ven beder dig lyve").</w:t>
             </w:r>
@@ -502,6 +527,7 @@
             <w:tcW w:type="dxa" w:w="4320"/>
           </w:tcPr>
           <w:p>
+            <w:r/>
             <w:r>
               <w:t>5 min</w:t>
             </w:r>
@@ -512,6 +538,7 @@
             <w:tcW w:type="dxa" w:w="4320"/>
           </w:tcPr>
           <w:p>
+            <w:r/>
             <w:r>
               <w:t>Inddel grupper (3-4), fordel roller (ordstyrer, referent, fremlægger).</w:t>
             </w:r>
@@ -524,6 +551,7 @@
             <w:tcW w:type="dxa" w:w="4320"/>
           </w:tcPr>
           <w:p>
+            <w:r/>
             <w:r>
               <w:t>35-45 min</w:t>
             </w:r>
@@ -534,6 +562,7 @@
             <w:tcW w:type="dxa" w:w="4320"/>
           </w:tcPr>
           <w:p>
+            <w:r/>
             <w:r>
               <w:t>Grupperne arbejder med dilemmaerne. Sæt evt. et minimum (fx "mindst 4 dilemmaer").</w:t>
             </w:r>
@@ -546,6 +575,7 @@
             <w:tcW w:type="dxa" w:w="4320"/>
           </w:tcPr>
           <w:p>
+            <w:r/>
             <w:r>
               <w:t>15 min</w:t>
             </w:r>
@@ -556,6 +586,7 @@
             <w:tcW w:type="dxa" w:w="4320"/>
           </w:tcPr>
           <w:p>
+            <w:r/>
             <w:r>
               <w:t>Fælles opsamling: hver gruppe fremlægger ét dilemma + hvor de var uenige.</w:t>
             </w:r>
@@ -568,6 +599,7 @@
             <w:tcW w:type="dxa" w:w="4320"/>
           </w:tcPr>
           <w:p>
+            <w:r/>
             <w:r>
               <w:t>10 min</w:t>
             </w:r>
@@ -578,6 +610,7 @@
             <w:tcW w:type="dxa" w:w="4320"/>
           </w:tcPr>
           <w:p>
+            <w:r/>
             <w:r>
               <w:t>Afrunding: de individuelle "tænk selv"-spørgsmål (kan gives som lektie).</w:t>
             </w:r>
@@ -585,28 +618,26 @@
         </w:tc>
       </w:tr>
     </w:tbl>
-    <w:p/>
     <w:p>
       <w:pPr>
-        <w:ind w:left="360"/>
+        <w:shd w:val="clear" w:fill="EEF1F6"/>
+        <w:ind w:left="259" w:right="144"/>
       </w:pPr>
       <w:r>
         <w:rPr>
           <w:b/>
-          <w:i/>
         </w:rPr>
         <w:t>Kortere version (45 min):</w:t>
       </w:r>
       <w:r>
-        <w:rPr>
-          <w:i/>
-        </w:rPr>
         <w:t xml:space="preserve"> Vælg 3 dilemmaer på forhånd (fx 1, 4 og 5) og spring "find selv et dilemma" over.</w:t>
       </w:r>
     </w:p>
     <w:p>
       <w:pPr>
-        <w:spacing w:after="120"/>
+        <w:pBdr>
+          <w:bottom w:val="single" w:sz="6" w:space="1" w:color="BBBBBB"/>
+        </w:pBdr>
       </w:pPr>
     </w:p>
     <w:p>
@@ -1043,7 +1074,9 @@
     </w:p>
     <w:p>
       <w:pPr>
-        <w:spacing w:after="120"/>
+        <w:pBdr>
+          <w:bottom w:val="single" w:sz="6" w:space="1" w:color="BBBBBB"/>
+        </w:pBdr>
       </w:pPr>
     </w:p>
     <w:p>

</xml_diff>